<commit_message>
use gpkg for geospatial data instead of gdb
</commit_message>
<xml_diff>
--- a/docs/posts/nepal-election-geojson/index.docx
+++ b/docs/posts/nepal-election-geojson/index.docx
@@ -508,7 +508,7 @@
         <w:rPr>
           <w:rStyle w:val="StringTok"/>
         </w:rPr>
-        <w:t xml:space="preserve">"nepal-wards.geojson"</w:t>
+        <w:t xml:space="preserve">"nepal-wards.gpkg"</w:t>
       </w:r>
       <w:r>
         <w:rPr>
@@ -571,7 +571,7 @@
         <w:rPr>
           <w:rStyle w:val="StringTok"/>
         </w:rPr>
-        <w:t xml:space="preserve">"nepal-national.geojson"</w:t>
+        <w:t xml:space="preserve">"nepal-national.gpkg"</w:t>
       </w:r>
       <w:r>
         <w:rPr>
@@ -5386,7 +5386,7 @@
         <w:rPr>
           <w:rStyle w:val="NormalTok"/>
         </w:rPr>
-        <w:t xml:space="preserve">(geometry)) </w:t>
+        <w:t xml:space="preserve">(geom)) </w:t>
       </w:r>
       <w:r>
         <w:rPr>

</xml_diff>

<commit_message>
update resume, migrate to uv, and add prompt engineering
</commit_message>
<xml_diff>
--- a/docs/posts/nepal-election-geojson/index.docx
+++ b/docs/posts/nepal-election-geojson/index.docx
@@ -60,7 +60,7 @@
         </w:p>
       </w:sdtContent>
     </w:sdt>
-    <w:bookmarkStart w:id="20" w:name="introduction"/>
+    <w:bookmarkStart w:id="9" w:name="introduction"/>
     <w:p>
       <w:pPr>
         <w:pStyle w:val="Heading2"/>
@@ -176,8 +176,8 @@
         <w:t xml:space="preserve">based on which constituency shape they fall into.</w:t>
       </w:r>
     </w:p>
-    <w:bookmarkEnd w:id="20"/>
-    <w:bookmarkStart w:id="21" w:name="setup-and-libraries"/>
+    <w:bookmarkEnd w:id="9"/>
+    <w:bookmarkStart w:id="10" w:name="setup-and-libraries"/>
     <w:p>
       <w:pPr>
         <w:pStyle w:val="Heading2"/>
@@ -886,8 +886,8 @@
         <w:t xml:space="preserve">)</w:t>
       </w:r>
     </w:p>
-    <w:bookmarkEnd w:id="21"/>
-    <w:bookmarkStart w:id="25" w:name="scraping-the-svg"/>
+    <w:bookmarkEnd w:id="10"/>
+    <w:bookmarkStart w:id="14" w:name="scraping-the-svg"/>
     <w:p>
       <w:pPr>
         <w:pStyle w:val="Heading2"/>
@@ -1737,12 +1737,12 @@
           <wp:inline>
             <wp:extent cx="5334000" cy="3000375"/>
             <wp:effectExtent b="0" l="0" r="0" t="0"/>
-            <wp:docPr descr="Scraped Electoral Map of Nepal in SVG format" title="" id="23" name="Picture"/>
+            <wp:docPr descr="Scraped Electoral Map of Nepal in SVG format" title="" id="12" name="Picture"/>
             <a:graphic>
               <a:graphicData uri="http://schemas.openxmlformats.org/drawingml/2006/picture">
                 <pic:pic>
                   <pic:nvPicPr>
-                    <pic:cNvPr descr="./output/nepal_electoral_map.svg" id="24" name="Picture"/>
+                    <pic:cNvPr descr="./output/nepal_electoral_map.svg" id="13" name="Picture"/>
                     <pic:cNvPicPr>
                       <a:picLocks noChangeArrowheads="1" noChangeAspect="1"/>
                     </pic:cNvPicPr>
@@ -1754,7 +1754,7 @@
                           <a14:useLocalDpi xmlns:a14="http://schemas.microsoft.com/office/drawing/2010/main" val="0"/>
                         </a:ext>
                         <a:ext uri="{96DAC541-7B7A-43D3-8B79-37D633B846F1}">
-                          <asvg:svgBlip xmlns:asvg="http://schemas.microsoft.com/office/drawing/2016/SVG/main" r:embed="rId22"/>
+                          <asvg:svgBlip xmlns:asvg="http://schemas.microsoft.com/office/drawing/2016/SVG/main" r:embed="rId11"/>
                         </a:ext>
                       </a:extLst>
                     </a:blip>
@@ -1792,8 +1792,8 @@
         <w:t xml:space="preserve">Scraped Electoral Map of Nepal in SVG format</w:t>
       </w:r>
     </w:p>
-    <w:bookmarkEnd w:id="25"/>
-    <w:bookmarkStart w:id="26" w:name="parsing-svg-paths-to-geometry"/>
+    <w:bookmarkEnd w:id="14"/>
+    <w:bookmarkStart w:id="15" w:name="parsing-svg-paths-to-geometry"/>
     <w:p>
       <w:pPr>
         <w:pStyle w:val="Heading2"/>
@@ -3255,8 +3255,8 @@
         <w:t xml:space="preserve">(polys_list))</w:t>
       </w:r>
     </w:p>
-    <w:bookmarkEnd w:id="26"/>
-    <w:bookmarkStart w:id="27" w:name="georeferencing-affine-transformation"/>
+    <w:bookmarkEnd w:id="15"/>
+    <w:bookmarkStart w:id="16" w:name="georeferencing-affine-transformation"/>
     <w:p>
       <w:pPr>
         <w:pStyle w:val="Heading2"/>
@@ -4637,8 +4637,8 @@
         <w:t xml:space="preserve">, rough_map_path)</w:t>
       </w:r>
     </w:p>
-    <w:bookmarkEnd w:id="27"/>
-    <w:bookmarkStart w:id="34" w:name="reconstruction-via-wards"/>
+    <w:bookmarkEnd w:id="16"/>
+    <w:bookmarkStart w:id="23" w:name="reconstruction-via-wards"/>
     <w:p>
       <w:pPr>
         <w:pStyle w:val="Heading2"/>
@@ -5911,18 +5911,18 @@
                 <wp:inline>
                   <wp:extent cx="152400" cy="152400"/>
                   <wp:effectExtent b="0" l="0" r="0" t="0"/>
-                  <wp:docPr descr="" title="" id="29" name="Picture"/>
+                  <wp:docPr descr="" title="" id="18" name="Picture"/>
                   <a:graphic>
                     <a:graphicData uri="http://schemas.openxmlformats.org/drawingml/2006/picture">
                       <pic:pic>
                         <pic:nvPicPr>
-                          <pic:cNvPr descr="C:\Program Files\Quarto\share\formats\docx\tip.png" id="30" name="Picture"/>
+                          <pic:cNvPr descr="C:\Program Files\Quarto\share\formats\docx\tip.png" id="19" name="Picture"/>
                           <pic:cNvPicPr>
                             <a:picLocks noChangeArrowheads="1" noChangeAspect="1"/>
                           </pic:cNvPicPr>
                         </pic:nvPicPr>
                         <pic:blipFill>
-                          <a:blip r:embed="rId28"/>
+                          <a:blip r:embed="rId17"/>
                           <a:stretch>
                             <a:fillRect/>
                           </a:stretch>
@@ -5978,7 +5978,7 @@
             <w:pPr>
               <w:spacing w:before="16" w:after="16"/>
             </w:pPr>
-            <w:hyperlink r:id="rId31">
+            <w:hyperlink r:id="rId20">
               <w:r>
                 <w:rPr>
                   <w:rStyle w:val="Hyperlink"/>
@@ -5989,7 +5989,7 @@
             <w:r>
               <w:t xml:space="preserve"> </w:t>
             </w:r>
-            <w:hyperlink r:id="rId32">
+            <w:hyperlink r:id="rId21">
               <w:r>
                 <w:rPr>
                   <w:rStyle w:val="Hyperlink"/>
@@ -6000,7 +6000,7 @@
             <w:r>
               <w:t xml:space="preserve"> </w:t>
             </w:r>
-            <w:hyperlink r:id="rId33">
+            <w:hyperlink r:id="rId22">
               <w:r>
                 <w:rPr>
                   <w:rStyle w:val="Hyperlink"/>
@@ -6013,7 +6013,7 @@
         </w:tc>
       </w:tr>
     </w:tbl>
-    <w:bookmarkEnd w:id="34"/>
+    <w:bookmarkEnd w:id="23"/>
     <w:sectPr>
       <w:footnotePr>
         <w:numRestart w:val="eachSect"/>
@@ -6280,10 +6280,10 @@
   <w:docDefaults>
     <w:rPrDefault>
       <w:rPr>
-        <w:rFonts w:asciiTheme="minorHAnsi" w:cstheme="minorBidi" w:eastAsiaTheme="minorHAnsi" w:hAnsiTheme="minorHAnsi"/>
+        <w:rFonts w:asciiTheme="minorHAnsi" w:cstheme="minorBidi" w:eastAsiaTheme="minorEastAsia" w:hAnsiTheme="minorHAnsi"/>
         <w:sz w:val="24"/>
         <w:szCs w:val="24"/>
-        <w:lang w:bidi="ar-SA" w:eastAsia="en-US" w:val="en-US"/>
+        <w:lang w:bidi="ar-SA" w:eastAsia="zh-CN" w:val="en-US"/>
       </w:rPr>
     </w:rPrDefault>
     <w:pPrDefault>
@@ -6824,13 +6824,6 @@
       </w:tblCellMar>
     </w:tblPr>
     <w:tblStylePr w:type="firstRow">
-      <w:tblPr>
-        <w:jc w:val="left"/>
-        <w:tblInd w:type="dxa" w:w="0"/>
-      </w:tblPr>
-      <w:trPr>
-        <w:jc w:val="left"/>
-      </w:trPr>
       <w:tcPr>
         <w:tcBorders>
           <w:bottom w:val="single"/>

</xml_diff>